<commit_message>
cái thiện chất lượng model 1
</commit_message>
<xml_diff>
--- a/docs/Report_Group3_BrainTumorAI.docx
+++ b/docs/Report_Group3_BrainTumorAI.docx
@@ -768,7 +768,7 @@
           <w:iCs/>
           <w:color w:val="000000"/>
         </w:rPr>
-        <w:t>17</w:t>
+        <w:t>18</w:t>
       </w:r>
       <w:r>
         <w:rPr>
@@ -874,8 +874,17 @@
           <w:i/>
           <w:iCs/>
         </w:rPr>
-        <w:t>TP. Hồ Chí Minh, ngày 17</w:t>
-      </w:r>
+        <w:t>TP. Hồ Chí Minh, ngày 1</w:t>
+      </w:r>
+      <w:r>
+        <w:rPr>
+          <w:i/>
+          <w:iCs/>
+        </w:rPr>
+        <w:t>8</w:t>
+      </w:r>
+      <w:bookmarkStart w:id="0" w:name="_GoBack"/>
+      <w:bookmarkEnd w:id="0"/>
       <w:r>
         <w:rPr>
           <w:i/>
@@ -6964,22 +6973,22 @@
       <w:pPr>
         <w:pStyle w:val="Heading1"/>
       </w:pPr>
-      <w:bookmarkStart w:id="0" w:name="_Toc234871350"/>
+      <w:bookmarkStart w:id="1" w:name="_Toc234871350"/>
       <w:r>
         <w:lastRenderedPageBreak/>
         <w:t>MỞ ĐẦU</w:t>
       </w:r>
-      <w:bookmarkEnd w:id="0"/>
+      <w:bookmarkEnd w:id="1"/>
     </w:p>
     <w:p>
       <w:pPr>
         <w:pStyle w:val="Heading2"/>
       </w:pPr>
-      <w:bookmarkStart w:id="1" w:name="_Toc234871351"/>
+      <w:bookmarkStart w:id="2" w:name="_Toc234871351"/>
       <w:r>
         <w:t>1. Lý do chọn đề tài</w:t>
       </w:r>
-      <w:bookmarkEnd w:id="1"/>
+      <w:bookmarkEnd w:id="2"/>
     </w:p>
     <w:p>
       <w:pPr>
@@ -7060,11 +7069,11 @@
       <w:pPr>
         <w:pStyle w:val="Heading2"/>
       </w:pPr>
-      <w:bookmarkStart w:id="2" w:name="_Toc234871352"/>
+      <w:bookmarkStart w:id="3" w:name="_Toc234871352"/>
       <w:r>
         <w:t>2. Mục tiêu nghiên cứu</w:t>
       </w:r>
-      <w:bookmarkEnd w:id="2"/>
+      <w:bookmarkEnd w:id="3"/>
     </w:p>
     <w:p>
       <w:pPr>
@@ -7151,11 +7160,11 @@
       <w:pPr>
         <w:pStyle w:val="Heading2"/>
       </w:pPr>
-      <w:bookmarkStart w:id="3" w:name="_Toc234871353"/>
+      <w:bookmarkStart w:id="4" w:name="_Toc234871353"/>
       <w:r>
         <w:t>3. Đối tượng và phạm vi nghiên cứu</w:t>
       </w:r>
-      <w:bookmarkEnd w:id="3"/>
+      <w:bookmarkEnd w:id="4"/>
     </w:p>
     <w:p>
       <w:pPr>
@@ -7219,11 +7228,11 @@
       <w:pPr>
         <w:pStyle w:val="Heading2"/>
       </w:pPr>
-      <w:bookmarkStart w:id="4" w:name="_Toc234871354"/>
+      <w:bookmarkStart w:id="5" w:name="_Toc234871354"/>
       <w:r>
         <w:t>4. Phương pháp nghiên cứu</w:t>
       </w:r>
-      <w:bookmarkEnd w:id="4"/>
+      <w:bookmarkEnd w:id="5"/>
     </w:p>
     <w:p>
       <w:pPr>
@@ -7253,22 +7262,22 @@
       <w:pPr>
         <w:pStyle w:val="Heading1"/>
       </w:pPr>
-      <w:bookmarkStart w:id="5" w:name="_Toc234871355"/>
+      <w:bookmarkStart w:id="6" w:name="_Toc234871355"/>
       <w:r>
         <w:lastRenderedPageBreak/>
         <w:t>CHƯƠNG 1: CƠ SỞ LÝ THUYẾT</w:t>
       </w:r>
-      <w:bookmarkEnd w:id="5"/>
+      <w:bookmarkEnd w:id="6"/>
     </w:p>
     <w:p>
       <w:pPr>
         <w:pStyle w:val="Heading2"/>
       </w:pPr>
-      <w:bookmarkStart w:id="6" w:name="_Toc234871356"/>
+      <w:bookmarkStart w:id="7" w:name="_Toc234871356"/>
       <w:r>
         <w:t>1.1 Tổng quan về khối u não và ảnh MRI</w:t>
       </w:r>
-      <w:bookmarkEnd w:id="6"/>
+      <w:bookmarkEnd w:id="7"/>
     </w:p>
     <w:p>
       <w:pPr>
@@ -7527,17 +7536,17 @@
       <w:pPr>
         <w:pStyle w:val="tittlebng"/>
       </w:pPr>
-      <w:bookmarkStart w:id="7" w:name="_Toc234871813"/>
+      <w:bookmarkStart w:id="8" w:name="_Toc234871813"/>
       <w:r>
         <w:t>Bảng 1.1. Bốn lớp phân loại trong bài toán Brain Tumor MRI Classification</w:t>
       </w:r>
-      <w:bookmarkEnd w:id="7"/>
+      <w:bookmarkEnd w:id="8"/>
     </w:p>
     <w:p>
       <w:pPr>
         <w:pStyle w:val="Heading2"/>
       </w:pPr>
-      <w:bookmarkStart w:id="8" w:name="_Toc234871357"/>
+      <w:bookmarkStart w:id="9" w:name="_Toc234871357"/>
       <w:r>
         <w:t>1.2 Mạng nơ-ron tích chậ</w:t>
       </w:r>
@@ -7550,7 +7559,7 @@
       <w:r>
         <w:t>CNN)</w:t>
       </w:r>
-      <w:bookmarkEnd w:id="8"/>
+      <w:bookmarkEnd w:id="9"/>
     </w:p>
     <w:p>
       <w:pPr>
@@ -7564,11 +7573,11 @@
       <w:pPr>
         <w:pStyle w:val="Heading2"/>
       </w:pPr>
-      <w:bookmarkStart w:id="9" w:name="_Toc234871358"/>
+      <w:bookmarkStart w:id="10" w:name="_Toc234871358"/>
       <w:r>
         <w:t>1.3 Học chuyển giao (Transfer Learning)</w:t>
       </w:r>
-      <w:bookmarkEnd w:id="9"/>
+      <w:bookmarkEnd w:id="10"/>
     </w:p>
     <w:p>
       <w:pPr>
@@ -7619,21 +7628,21 @@
       <w:pPr>
         <w:pStyle w:val="Heading2"/>
       </w:pPr>
-      <w:bookmarkStart w:id="10" w:name="_Toc234871359"/>
+      <w:bookmarkStart w:id="11" w:name="_Toc234871359"/>
       <w:r>
         <w:t>1.4 Kiến trúc mô hình sử dụng</w:t>
       </w:r>
-      <w:bookmarkEnd w:id="10"/>
+      <w:bookmarkEnd w:id="11"/>
     </w:p>
     <w:p>
       <w:pPr>
         <w:pStyle w:val="Heading3"/>
       </w:pPr>
-      <w:bookmarkStart w:id="11" w:name="_Toc234871360"/>
+      <w:bookmarkStart w:id="12" w:name="_Toc234871360"/>
       <w:r>
         <w:t>1.4.1 EfficientNetB0</w:t>
       </w:r>
-      <w:bookmarkEnd w:id="11"/>
+      <w:bookmarkEnd w:id="12"/>
     </w:p>
     <w:p>
       <w:pPr>
@@ -7656,11 +7665,11 @@
       <w:pPr>
         <w:pStyle w:val="Heading3"/>
       </w:pPr>
-      <w:bookmarkStart w:id="12" w:name="_Toc234871361"/>
+      <w:bookmarkStart w:id="13" w:name="_Toc234871361"/>
       <w:r>
         <w:t>1.4.2 DenseNet121</w:t>
       </w:r>
-      <w:bookmarkEnd w:id="12"/>
+      <w:bookmarkEnd w:id="13"/>
     </w:p>
     <w:p>
       <w:pPr>
@@ -7674,7 +7683,7 @@
       <w:pPr>
         <w:pStyle w:val="Heading2"/>
       </w:pPr>
-      <w:bookmarkStart w:id="13" w:name="_Toc234871362"/>
+      <w:bookmarkStart w:id="14" w:name="_Toc234871362"/>
       <w:r>
         <w:t xml:space="preserve">1.5 Trí tuệ nhân tạo có thể giải thích </w:t>
       </w:r>
@@ -7684,7 +7693,7 @@
       <w:r>
         <w:t xml:space="preserve"> Grad-CAM</w:t>
       </w:r>
-      <w:bookmarkEnd w:id="13"/>
+      <w:bookmarkEnd w:id="14"/>
     </w:p>
     <w:p>
       <w:pPr>
@@ -7709,6 +7718,9 @@
         <w:jc w:val="center"/>
       </w:pPr>
       <w:r>
+        <w:rPr>
+          <w:noProof/>
+        </w:rPr>
         <w:drawing>
           <wp:inline distT="0" distB="0" distL="0" distR="0" wp14:anchorId="7A20CC2B" wp14:editId="168AA354">
             <wp:extent cx="5013434" cy="3813547"/>
@@ -7751,6 +7763,9 @@
         <w:jc w:val="center"/>
       </w:pPr>
       <w:r>
+        <w:rPr>
+          <w:noProof/>
+        </w:rPr>
         <w:drawing>
           <wp:inline distT="0" distB="0" distL="0" distR="0" wp14:anchorId="290E2A13" wp14:editId="7573FC1B">
             <wp:extent cx="4903076" cy="3639876"/>
@@ -7792,11 +7807,11 @@
       <w:pPr>
         <w:pStyle w:val="tittlehnhnh"/>
       </w:pPr>
-      <w:bookmarkStart w:id="14" w:name="_Toc234871846"/>
+      <w:bookmarkStart w:id="15" w:name="_Toc234871846"/>
       <w:r>
         <w:t>Hình 1.1. Heatmap Grad-CAM thực tế</w:t>
       </w:r>
-      <w:bookmarkEnd w:id="14"/>
+      <w:bookmarkEnd w:id="15"/>
     </w:p>
     <w:p>
       <w:r>
@@ -7807,22 +7822,22 @@
       <w:pPr>
         <w:pStyle w:val="Heading1"/>
       </w:pPr>
-      <w:bookmarkStart w:id="15" w:name="_Toc234871363"/>
+      <w:bookmarkStart w:id="16" w:name="_Toc234871363"/>
       <w:r>
         <w:lastRenderedPageBreak/>
         <w:t>CHƯƠNG 2: PHÂN TÍCH VÀ THIẾT KẾ HỆ THỐNG</w:t>
       </w:r>
-      <w:bookmarkEnd w:id="15"/>
+      <w:bookmarkEnd w:id="16"/>
     </w:p>
     <w:p>
       <w:pPr>
         <w:pStyle w:val="Heading2"/>
       </w:pPr>
-      <w:bookmarkStart w:id="16" w:name="_Toc234871364"/>
+      <w:bookmarkStart w:id="17" w:name="_Toc234871364"/>
       <w:r>
         <w:t>2.1 Phát biểu bài toán</w:t>
       </w:r>
-      <w:bookmarkEnd w:id="16"/>
+      <w:bookmarkEnd w:id="17"/>
     </w:p>
     <w:p>
       <w:pPr>
@@ -7836,21 +7851,21 @@
       <w:pPr>
         <w:pStyle w:val="Heading2"/>
       </w:pPr>
-      <w:bookmarkStart w:id="17" w:name="_Toc234871365"/>
+      <w:bookmarkStart w:id="18" w:name="_Toc234871365"/>
       <w:r>
         <w:t>2.2 Yêu cầu hệ thống</w:t>
       </w:r>
-      <w:bookmarkEnd w:id="17"/>
+      <w:bookmarkEnd w:id="18"/>
     </w:p>
     <w:p>
       <w:pPr>
         <w:pStyle w:val="Heading3"/>
       </w:pPr>
-      <w:bookmarkStart w:id="18" w:name="_Toc234871366"/>
+      <w:bookmarkStart w:id="19" w:name="_Toc234871366"/>
       <w:r>
         <w:t>2.2.1 Yêu cầu chức năng</w:t>
       </w:r>
-      <w:bookmarkEnd w:id="18"/>
+      <w:bookmarkEnd w:id="19"/>
     </w:p>
     <w:tbl>
       <w:tblPr>
@@ -8174,21 +8189,21 @@
       <w:pPr>
         <w:pStyle w:val="tittlebng"/>
       </w:pPr>
-      <w:bookmarkStart w:id="19" w:name="_Toc234871814"/>
+      <w:bookmarkStart w:id="20" w:name="_Toc234871814"/>
       <w:r>
         <w:t>Bảng 2.1. Danh sách yêu cầu chức năng</w:t>
       </w:r>
-      <w:bookmarkEnd w:id="19"/>
+      <w:bookmarkEnd w:id="20"/>
     </w:p>
     <w:p>
       <w:pPr>
         <w:pStyle w:val="Heading3"/>
       </w:pPr>
-      <w:bookmarkStart w:id="20" w:name="_Toc234871367"/>
+      <w:bookmarkStart w:id="21" w:name="_Toc234871367"/>
       <w:r>
         <w:t>2.2.2 Yêu cầu phi chức năng</w:t>
       </w:r>
-      <w:bookmarkEnd w:id="20"/>
+      <w:bookmarkEnd w:id="21"/>
     </w:p>
     <w:tbl>
       <w:tblPr>
@@ -8462,21 +8477,21 @@
       <w:pPr>
         <w:pStyle w:val="tittlebng"/>
       </w:pPr>
-      <w:bookmarkStart w:id="21" w:name="_Toc234871815"/>
+      <w:bookmarkStart w:id="22" w:name="_Toc234871815"/>
       <w:r>
         <w:t>Bảng 2.2. Danh sách yêu cầu phi chức năng</w:t>
       </w:r>
-      <w:bookmarkEnd w:id="21"/>
+      <w:bookmarkEnd w:id="22"/>
     </w:p>
     <w:p>
       <w:pPr>
         <w:pStyle w:val="Heading2"/>
       </w:pPr>
-      <w:bookmarkStart w:id="22" w:name="_Toc234871368"/>
+      <w:bookmarkStart w:id="23" w:name="_Toc234871368"/>
       <w:r>
         <w:t>2.3 Kiến trúc tổng thể hệ thống</w:t>
       </w:r>
-      <w:bookmarkEnd w:id="22"/>
+      <w:bookmarkEnd w:id="23"/>
     </w:p>
     <w:p>
       <w:pPr>
@@ -8618,21 +8633,21 @@
       <w:r>
         <w:t xml:space="preserve"> </w:t>
       </w:r>
-      <w:bookmarkStart w:id="23" w:name="_Toc234871847"/>
+      <w:bookmarkStart w:id="24" w:name="_Toc234871847"/>
       <w:r>
         <w:t>Hình 2.1. Sơ đồ kiến trúc hệ thống</w:t>
       </w:r>
-      <w:bookmarkEnd w:id="23"/>
+      <w:bookmarkEnd w:id="24"/>
     </w:p>
     <w:p>
       <w:pPr>
         <w:pStyle w:val="Heading2"/>
       </w:pPr>
-      <w:bookmarkStart w:id="24" w:name="_Toc234871369"/>
+      <w:bookmarkStart w:id="25" w:name="_Toc234871369"/>
       <w:r>
         <w:t>2.4 Kiến trúc mã nguồn dự án</w:t>
       </w:r>
-      <w:bookmarkEnd w:id="24"/>
+      <w:bookmarkEnd w:id="25"/>
     </w:p>
     <w:p>
       <w:pPr>
@@ -9070,21 +9085,21 @@
       <w:pPr>
         <w:pStyle w:val="tittlebng"/>
       </w:pPr>
-      <w:bookmarkStart w:id="25" w:name="_Toc234871816"/>
+      <w:bookmarkStart w:id="26" w:name="_Toc234871816"/>
       <w:r>
         <w:t>Bảng 2.3. Cấu trúc thư mục và vai trò các module chính</w:t>
       </w:r>
-      <w:bookmarkEnd w:id="25"/>
+      <w:bookmarkEnd w:id="26"/>
     </w:p>
     <w:p>
       <w:pPr>
         <w:pStyle w:val="Heading2"/>
       </w:pPr>
-      <w:bookmarkStart w:id="26" w:name="_Toc234871370"/>
+      <w:bookmarkStart w:id="27" w:name="_Toc234871370"/>
       <w:r>
         <w:t>2.5 Bộ dữ liệu (Dataset)</w:t>
       </w:r>
-      <w:bookmarkEnd w:id="26"/>
+      <w:bookmarkEnd w:id="27"/>
     </w:p>
     <w:p>
       <w:pPr>
@@ -9354,11 +9369,11 @@
       <w:pPr>
         <w:pStyle w:val="tittlebng"/>
       </w:pPr>
-      <w:bookmarkStart w:id="27" w:name="_Toc234871817"/>
+      <w:bookmarkStart w:id="28" w:name="_Toc234871817"/>
       <w:r>
         <w:t>Bảng 2.4. Thống kê bộ dữ liệu sử dụng</w:t>
       </w:r>
-      <w:bookmarkEnd w:id="27"/>
+      <w:bookmarkEnd w:id="28"/>
     </w:p>
     <w:p>
       <w:pPr>
@@ -9410,21 +9425,21 @@
       <w:pPr>
         <w:pStyle w:val="tittlehnhnh"/>
       </w:pPr>
-      <w:bookmarkStart w:id="28" w:name="_Toc234871848"/>
+      <w:bookmarkStart w:id="29" w:name="_Toc234871848"/>
       <w:r>
         <w:t>Hình 2.2. Biểu đồ phân bố số lượng ảnh theo từng lớp</w:t>
       </w:r>
-      <w:bookmarkEnd w:id="28"/>
+      <w:bookmarkEnd w:id="29"/>
     </w:p>
     <w:p>
       <w:pPr>
         <w:pStyle w:val="Heading2"/>
       </w:pPr>
-      <w:bookmarkStart w:id="29" w:name="_Toc234871371"/>
+      <w:bookmarkStart w:id="30" w:name="_Toc234871371"/>
       <w:r>
         <w:t>2.6 Tiền xử lý dữ liệu và Data Augmentation</w:t>
       </w:r>
-      <w:bookmarkEnd w:id="29"/>
+      <w:bookmarkEnd w:id="30"/>
     </w:p>
     <w:p>
       <w:pPr>
@@ -9775,11 +9790,11 @@
       <w:pPr>
         <w:pStyle w:val="tittlebng"/>
       </w:pPr>
-      <w:bookmarkStart w:id="30" w:name="_Toc234871818"/>
+      <w:bookmarkStart w:id="31" w:name="_Toc234871818"/>
       <w:r>
         <w:t>Bảng 2.5. Các kỹ thuật Data Augmentation áp dụng trong huấn luyện</w:t>
       </w:r>
-      <w:bookmarkEnd w:id="30"/>
+      <w:bookmarkEnd w:id="31"/>
     </w:p>
     <w:p>
       <w:pPr>
@@ -9839,11 +9854,11 @@
         <w:lastRenderedPageBreak/>
         <w:tab/>
       </w:r>
-      <w:bookmarkStart w:id="31" w:name="_Toc234871849"/>
+      <w:bookmarkStart w:id="32" w:name="_Toc234871849"/>
       <w:r>
         <w:t>Hình 2.3. Phân bố kích thước ảnh</w:t>
       </w:r>
-      <w:bookmarkEnd w:id="31"/>
+      <w:bookmarkEnd w:id="32"/>
       <w:r>
         <w:tab/>
       </w:r>
@@ -9897,11 +9912,11 @@
       <w:pPr>
         <w:pStyle w:val="tittlehnhnh"/>
       </w:pPr>
-      <w:bookmarkStart w:id="32" w:name="_Toc234871850"/>
+      <w:bookmarkStart w:id="33" w:name="_Toc234871850"/>
       <w:r>
         <w:t>Hình 2.4. Phân bố cường độ sáng trung bình theo nhãn</w:t>
       </w:r>
-      <w:bookmarkEnd w:id="32"/>
+      <w:bookmarkEnd w:id="33"/>
     </w:p>
     <w:p>
       <w:pPr>
@@ -9952,14 +9967,14 @@
       <w:pPr>
         <w:pStyle w:val="tittlehnhnh"/>
       </w:pPr>
-      <w:bookmarkStart w:id="33" w:name="_Toc234871851"/>
+      <w:bookmarkStart w:id="34" w:name="_Toc234871851"/>
       <w:r>
         <w:t xml:space="preserve">Hình 2.5. Phân bố </w:t>
       </w:r>
       <w:r>
         <w:t>ảnh mẫu</w:t>
       </w:r>
-      <w:bookmarkEnd w:id="33"/>
+      <w:bookmarkEnd w:id="34"/>
     </w:p>
     <w:p>
       <w:pPr>
@@ -10011,11 +10026,11 @@
       <w:pPr>
         <w:pStyle w:val="tittlehnhnh"/>
       </w:pPr>
-      <w:bookmarkStart w:id="34" w:name="_Toc234871852"/>
+      <w:bookmarkStart w:id="35" w:name="_Toc234871852"/>
       <w:r>
         <w:t>Hình 2.6. Ảnh trung bình</w:t>
       </w:r>
-      <w:bookmarkEnd w:id="34"/>
+      <w:bookmarkEnd w:id="35"/>
       <w:r>
         <w:br w:type="page"/>
       </w:r>
@@ -10024,22 +10039,22 @@
       <w:pPr>
         <w:pStyle w:val="Heading1"/>
       </w:pPr>
-      <w:bookmarkStart w:id="35" w:name="_Toc234871372"/>
+      <w:bookmarkStart w:id="36" w:name="_Toc234871372"/>
       <w:r>
         <w:lastRenderedPageBreak/>
         <w:t>CHƯƠNG 3: HUẤN LUYỆN VÀ ĐÁNH GIÁ MÔ HÌNH</w:t>
       </w:r>
-      <w:bookmarkEnd w:id="35"/>
+      <w:bookmarkEnd w:id="36"/>
     </w:p>
     <w:p>
       <w:pPr>
         <w:pStyle w:val="Heading2"/>
       </w:pPr>
-      <w:bookmarkStart w:id="36" w:name="_Toc234871373"/>
+      <w:bookmarkStart w:id="37" w:name="_Toc234871373"/>
       <w:r>
         <w:t>3.1 Cấu hình huấn luyện</w:t>
       </w:r>
-      <w:bookmarkEnd w:id="36"/>
+      <w:bookmarkEnd w:id="37"/>
     </w:p>
     <w:p>
       <w:pPr>
@@ -10402,21 +10417,21 @@
       <w:pPr>
         <w:pStyle w:val="tittlebng"/>
       </w:pPr>
-      <w:bookmarkStart w:id="37" w:name="_Toc234871819"/>
+      <w:bookmarkStart w:id="38" w:name="_Toc234871819"/>
       <w:r>
         <w:t>Bảng 3.1. Cấu hình huấn luyện áp dụng cho cả hai mô hình</w:t>
       </w:r>
-      <w:bookmarkEnd w:id="37"/>
+      <w:bookmarkEnd w:id="38"/>
     </w:p>
     <w:p>
       <w:pPr>
         <w:pStyle w:val="Heading2"/>
       </w:pPr>
-      <w:bookmarkStart w:id="38" w:name="_Toc234871374"/>
+      <w:bookmarkStart w:id="39" w:name="_Toc234871374"/>
       <w:r>
         <w:t>3.2 Kết quả huấn luyện EfficientNetB0</w:t>
       </w:r>
-      <w:bookmarkEnd w:id="38"/>
+      <w:bookmarkEnd w:id="39"/>
     </w:p>
     <w:p>
       <w:pPr>
@@ -10667,7 +10682,7 @@
       <w:pPr>
         <w:pStyle w:val="tittlebng"/>
       </w:pPr>
-      <w:bookmarkStart w:id="39" w:name="_Toc234871820"/>
+      <w:bookmarkStart w:id="40" w:name="_Toc234871820"/>
       <w:r>
         <w:t>Bảng 3</w:t>
       </w:r>
@@ -10677,7 +10692,7 @@
       <w:r>
         <w:t>EfficientNetB0 (Phase 2)</w:t>
       </w:r>
-      <w:bookmarkEnd w:id="39"/>
+      <w:bookmarkEnd w:id="40"/>
     </w:p>
     <w:p>
       <w:pPr>
@@ -11255,14 +11270,14 @@
       <w:pPr>
         <w:pStyle w:val="tittlebng"/>
       </w:pPr>
-      <w:bookmarkStart w:id="40" w:name="_Toc234871821"/>
+      <w:bookmarkStart w:id="41" w:name="_Toc234871821"/>
       <w:r>
         <w:t xml:space="preserve">Bảng 3.3. Classification Report - </w:t>
       </w:r>
       <w:r>
         <w:t>EfficientNetB0 (Validation set)</w:t>
       </w:r>
-      <w:bookmarkEnd w:id="40"/>
+      <w:bookmarkEnd w:id="41"/>
     </w:p>
     <w:p>
       <w:pPr>
@@ -11559,21 +11574,21 @@
       <w:pPr>
         <w:pStyle w:val="tittlebng"/>
       </w:pPr>
-      <w:bookmarkStart w:id="41" w:name="_Toc234871822"/>
+      <w:bookmarkStart w:id="42" w:name="_Toc234871822"/>
       <w:r>
         <w:t>Bảng 3.4. Hiệu năng EfficientNetB0 trên tập Test độc lập</w:t>
       </w:r>
-      <w:bookmarkEnd w:id="41"/>
+      <w:bookmarkEnd w:id="42"/>
     </w:p>
     <w:p>
       <w:pPr>
         <w:pStyle w:val="Heading2"/>
       </w:pPr>
-      <w:bookmarkStart w:id="42" w:name="_Toc234871375"/>
+      <w:bookmarkStart w:id="43" w:name="_Toc234871375"/>
       <w:r>
         <w:t>3.3 Kết quả huấn luyện DenseNet121</w:t>
       </w:r>
-      <w:bookmarkEnd w:id="42"/>
+      <w:bookmarkEnd w:id="43"/>
     </w:p>
     <w:p>
       <w:pPr>
@@ -12147,7 +12162,7 @@
       <w:pPr>
         <w:pStyle w:val="tittlebng"/>
       </w:pPr>
-      <w:bookmarkStart w:id="43" w:name="_Toc234871823"/>
+      <w:bookmarkStart w:id="44" w:name="_Toc234871823"/>
       <w:r>
         <w:t>Bảng 3.5. Classification Report</w:t>
       </w:r>
@@ -12157,7 +12172,7 @@
       <w:r>
         <w:t xml:space="preserve"> DenseNet121 (Validation set, best val_acc = 99.46% tại epoch 12)</w:t>
       </w:r>
-      <w:bookmarkEnd w:id="43"/>
+      <w:bookmarkEnd w:id="44"/>
     </w:p>
     <w:tbl>
       <w:tblPr>
@@ -12439,11 +12454,11 @@
       <w:pPr>
         <w:pStyle w:val="tittlebng"/>
       </w:pPr>
-      <w:bookmarkStart w:id="44" w:name="_Toc234871824"/>
+      <w:bookmarkStart w:id="45" w:name="_Toc234871824"/>
       <w:r>
         <w:t>Bảng 3.6. Hiệu năng DenseNet121 trên tập Test độc lập</w:t>
       </w:r>
-      <w:bookmarkEnd w:id="44"/>
+      <w:bookmarkEnd w:id="45"/>
     </w:p>
     <w:p>
       <w:pPr>
@@ -12495,7 +12510,7 @@
       <w:pPr>
         <w:pStyle w:val="tittlehnhnh"/>
       </w:pPr>
-      <w:bookmarkStart w:id="45" w:name="_Toc234871853"/>
+      <w:bookmarkStart w:id="46" w:name="_Toc234871853"/>
       <w:r>
         <w:t xml:space="preserve">Hình 3.1. Biểu đồ Training/Validation Loss &amp; Accuracy qua các </w:t>
       </w:r>
@@ -12513,17 +12528,17 @@
       <w:r>
         <w:t xml:space="preserve"> EfficientNetB0 và DenseNet121</w:t>
       </w:r>
-      <w:bookmarkEnd w:id="45"/>
+      <w:bookmarkEnd w:id="46"/>
     </w:p>
     <w:p>
       <w:pPr>
         <w:pStyle w:val="Heading2"/>
       </w:pPr>
-      <w:bookmarkStart w:id="46" w:name="_Toc234871376"/>
+      <w:bookmarkStart w:id="47" w:name="_Toc234871376"/>
       <w:r>
         <w:t>3.4 So sánh hai mô hình</w:t>
       </w:r>
-      <w:bookmarkEnd w:id="46"/>
+      <w:bookmarkEnd w:id="47"/>
     </w:p>
     <w:tbl>
       <w:tblPr>
@@ -12940,11 +12955,11 @@
       <w:pPr>
         <w:pStyle w:val="tittlebng"/>
       </w:pPr>
-      <w:bookmarkStart w:id="47" w:name="_Toc234871825"/>
+      <w:bookmarkStart w:id="48" w:name="_Toc234871825"/>
       <w:r>
         <w:t>Bảng 3.7. Bảng so sánh tổng hợp EfficientNetB0 và DenseNet121</w:t>
       </w:r>
-      <w:bookmarkEnd w:id="47"/>
+      <w:bookmarkEnd w:id="48"/>
     </w:p>
     <w:p>
       <w:pPr>
@@ -12996,12 +13011,12 @@
       <w:pPr>
         <w:pStyle w:val="tittlehnhnh"/>
       </w:pPr>
-      <w:bookmarkStart w:id="48" w:name="_Toc234871854"/>
+      <w:bookmarkStart w:id="49" w:name="_Toc234871854"/>
       <w:r>
         <w:lastRenderedPageBreak/>
         <w:t>Hình 3.2. Biểu đồ so sánh các chỉ số Accuracy / Precision / Recall / F1 / AUC giữa hai mô hình</w:t>
       </w:r>
-      <w:bookmarkEnd w:id="48"/>
+      <w:bookmarkEnd w:id="49"/>
     </w:p>
     <w:p>
       <w:pPr>
@@ -13053,11 +13068,11 @@
       <w:pPr>
         <w:pStyle w:val="tittlehnhnh"/>
       </w:pPr>
-      <w:bookmarkStart w:id="49" w:name="_Toc234871855"/>
+      <w:bookmarkStart w:id="50" w:name="_Toc234871855"/>
       <w:r>
         <w:t>Hình 3.3. So sánh F1-score theo từng lớp giữa EfficientNetB0 và DenseNet121</w:t>
       </w:r>
-      <w:bookmarkEnd w:id="49"/>
+      <w:bookmarkEnd w:id="50"/>
     </w:p>
     <w:p>
       <w:pPr>
@@ -13109,11 +13124,11 @@
       <w:pPr>
         <w:pStyle w:val="tittlehnhnh"/>
       </w:pPr>
-      <w:bookmarkStart w:id="50" w:name="_Toc234871856"/>
+      <w:bookmarkStart w:id="51" w:name="_Toc234871856"/>
       <w:r>
         <w:t>Hình 3.4. Ma trận nhầm lẫn (Confusion Matrix) của hai mô hình trên tập Test</w:t>
       </w:r>
-      <w:bookmarkEnd w:id="50"/>
+      <w:bookmarkEnd w:id="51"/>
     </w:p>
     <w:p>
       <w:pPr>
@@ -13165,11 +13180,11 @@
       <w:pPr>
         <w:pStyle w:val="tittlehnhnh"/>
       </w:pPr>
-      <w:bookmarkStart w:id="51" w:name="_Toc234871857"/>
+      <w:bookmarkStart w:id="52" w:name="_Toc234871857"/>
       <w:r>
         <w:t>Hình 3.5. Đường cong ROC theo từng lớp của hai mô hình</w:t>
       </w:r>
-      <w:bookmarkEnd w:id="51"/>
+      <w:bookmarkEnd w:id="52"/>
     </w:p>
     <w:p>
       <w:pPr>
@@ -13222,11 +13237,11 @@
       <w:pPr>
         <w:pStyle w:val="tittlehnhnh"/>
       </w:pPr>
-      <w:bookmarkStart w:id="52" w:name="_Toc234871858"/>
+      <w:bookmarkStart w:id="53" w:name="_Toc234871858"/>
       <w:r>
         <w:t>Hình 3.6. Dashboard tổng hợp kết quả đánh giá mô hình</w:t>
       </w:r>
-      <w:bookmarkEnd w:id="52"/>
+      <w:bookmarkEnd w:id="53"/>
     </w:p>
     <w:p>
       <w:r>
@@ -13237,18 +13252,18 @@
       <w:pPr>
         <w:pStyle w:val="Heading1"/>
       </w:pPr>
-      <w:bookmarkStart w:id="53" w:name="_Toc234871377"/>
+      <w:bookmarkStart w:id="54" w:name="_Toc234871377"/>
       <w:r>
         <w:lastRenderedPageBreak/>
         <w:t>CHƯƠNG 4: TRIỂN KHAI HỆ THỐNG</w:t>
       </w:r>
-      <w:bookmarkEnd w:id="53"/>
+      <w:bookmarkEnd w:id="54"/>
     </w:p>
     <w:p>
       <w:pPr>
         <w:pStyle w:val="Heading2"/>
       </w:pPr>
-      <w:bookmarkStart w:id="54" w:name="_Toc234871378"/>
+      <w:bookmarkStart w:id="55" w:name="_Toc234871378"/>
       <w:r>
         <w:t xml:space="preserve">4.1 Backend </w:t>
       </w:r>
@@ -13258,7 +13273,7 @@
       <w:r>
         <w:t>FastAPI</w:t>
       </w:r>
-      <w:bookmarkEnd w:id="54"/>
+      <w:bookmarkEnd w:id="55"/>
     </w:p>
     <w:p>
       <w:pPr>
@@ -13559,11 +13574,11 @@
       <w:pPr>
         <w:pStyle w:val="tittlebng"/>
       </w:pPr>
-      <w:bookmarkStart w:id="55" w:name="_Toc234871826"/>
+      <w:bookmarkStart w:id="56" w:name="_Toc234871826"/>
       <w:r>
         <w:t>Bảng 4.1. Danh sách API Endpoint của Backend</w:t>
       </w:r>
-      <w:bookmarkEnd w:id="55"/>
+      <w:bookmarkEnd w:id="56"/>
     </w:p>
     <w:p>
       <w:pPr>
@@ -13577,14 +13592,14 @@
       <w:pPr>
         <w:pStyle w:val="Heading2"/>
       </w:pPr>
-      <w:bookmarkStart w:id="56" w:name="_Toc234871379"/>
+      <w:bookmarkStart w:id="57" w:name="_Toc234871379"/>
       <w:r>
         <w:t xml:space="preserve">4.2 Frontend - </w:t>
       </w:r>
       <w:r>
         <w:t>Next.js</w:t>
       </w:r>
-      <w:bookmarkEnd w:id="56"/>
+      <w:bookmarkEnd w:id="57"/>
     </w:p>
     <w:p>
       <w:pPr>
@@ -13599,6 +13614,9 @@
         <w:jc w:val="center"/>
       </w:pPr>
       <w:r>
+        <w:rPr>
+          <w:noProof/>
+        </w:rPr>
         <w:lastRenderedPageBreak/>
         <w:drawing>
           <wp:inline distT="0" distB="0" distL="0" distR="0" wp14:anchorId="355DCC53" wp14:editId="328F1272">
@@ -13636,8 +13654,6 @@
           </wp:inline>
         </w:drawing>
       </w:r>
-      <w:bookmarkStart w:id="57" w:name="_GoBack"/>
-      <w:bookmarkEnd w:id="57"/>
     </w:p>
     <w:p>
       <w:pPr>
@@ -16186,7 +16202,7 @@
 </file>
 
 <file path=customXml/itemProps1.xml><?xml version="1.0" encoding="utf-8"?>
-<ds:datastoreItem xmlns:ds="http://schemas.openxmlformats.org/officeDocument/2006/customXml" ds:itemID="{2FFE2564-A579-4DF5-B2D1-8F822CCED283}">
+<ds:datastoreItem xmlns:ds="http://schemas.openxmlformats.org/officeDocument/2006/customXml" ds:itemID="{8596EB50-E03D-4233-9942-36125C1D6964}">
   <ds:schemaRefs>
     <ds:schemaRef ds:uri="http://schemas.openxmlformats.org/officeDocument/2006/bibliography"/>
   </ds:schemaRefs>

</xml_diff>